<commit_message>
docs(report): revise W1 contribution split and Vietnamese wording
</commit_message>
<xml_diff>
--- a/docs/weekly-reports/W01/weekly-report-W01.docx
+++ b/docs/weekly-reports/W01/weekly-report-W01.docx
@@ -113,7 +113,7 @@
               <w:pStyle w:val="Compact"/>
             </w:pPr>
             <w:r>
-              <w:t xml:space="preserve">Sinh viên</w:t>
+              <w:t xml:space="preserve">Sinh viên thực hiện</w:t>
             </w:r>
           </w:p>
         </w:tc>
@@ -137,7 +137,7 @@
               <w:pStyle w:val="Compact"/>
             </w:pPr>
             <w:r>
-              <w:t xml:space="preserve">GVHD</w:t>
+              <w:t xml:space="preserve">Giảng viên hướng dẫn</w:t>
             </w:r>
           </w:p>
         </w:tc>
@@ -161,7 +161,7 @@
               <w:pStyle w:val="Compact"/>
             </w:pPr>
             <w:r>
-              <w:t xml:space="preserve">Thời gian đồ án</w:t>
+              <w:t xml:space="preserve">Thời gian thực hiện đồ án</w:t>
             </w:r>
           </w:p>
         </w:tc>
@@ -196,7 +196,7 @@
               <w:pStyle w:val="Compact"/>
             </w:pPr>
             <w:r>
-              <w:t xml:space="preserve">W1: 27/09/2026 – 03/10/2026</w:t>
+              <w:t xml:space="preserve">Tuần 1 (W1): 27/09/2026 – 03/10/2026</w:t>
             </w:r>
           </w:p>
         </w:tc>
@@ -235,7 +235,7 @@
               <w:t xml:space="preserve"> </w:t>
             </w:r>
             <w:r>
-              <w:t xml:space="preserve">(03/10/2026 15:28). Mọi commit từ 04/10/2026 bị loại khỏi báo cáo</w:t>
+              <w:t xml:space="preserve">(03/10/2026, 15:28). Các commit từ 04/10/2026 trở đi không được tính vào báo cáo này</w:t>
             </w:r>
           </w:p>
         </w:tc>
@@ -269,7 +269,7 @@
               <w:t xml:space="preserve">proposal source not found in repository</w:t>
             </w:r>
             <w:r>
-              <w:t xml:space="preserve">); nội dung W1 lấy từ đề cương do nhóm cung cấp</w:t>
+              <w:t xml:space="preserve">). Nội dung kế hoạch W1 được lấy từ đề cương do nhóm cung cấp</w:t>
             </w:r>
           </w:p>
         </w:tc>
@@ -290,7 +290,7 @@
         <w:pStyle w:val="FirstParagraph"/>
       </w:pPr>
       <w:r>
-        <w:t xml:space="preserve">Theo đề cương: chọn phạm vi thành phố, xác định nguồn POI và license, chốt MVP. Output: Data/source card, repository, POI pilot dataset.</w:t>
+        <w:t xml:space="preserve">Theo đề cương, W1 gồm ba nhiệm vụ: chọn phạm vi thành phố, xác định nguồn dữ liệu POI cùng license, và chốt phạm vi MVP. Sản phẩm cần nộp gồm Data/source card, repository và tập dữ liệu POI thử nghiệm (pilot dataset).</w:t>
       </w:r>
     </w:p>
     <w:bookmarkEnd w:id="10"/>
@@ -308,7 +308,7 @@
         <w:pStyle w:val="FirstParagraph"/>
       </w:pPr>
       <w:r>
-        <w:t xml:space="preserve">(1) City scope; (2) POI sources + license; (3) MVP; (4) Data/source card; (5) Repository; (6) POI pilot dataset.</w:t>
+        <w:t xml:space="preserve">(1) Chọn phạm vi thành phố; (2) xác định nguồn POI và license; (3) chốt MVP; (4) lập Data/source card; (5) thiết lập repository; (6) xây dựng POI pilot dataset.</w:t>
       </w:r>
     </w:p>
     <w:bookmarkEnd w:id="11"/>
@@ -326,7 +326,7 @@
         <w:pStyle w:val="FirstParagraph"/>
       </w:pPr>
       <w:r>
-        <w:t xml:space="preserve">Trạng thái:</w:t>
+        <w:t xml:space="preserve">Quy ước trạng thái:</w:t>
       </w:r>
       <w:r>
         <w:t xml:space="preserve"> </w:t>
@@ -342,7 +342,7 @@
         <w:t xml:space="preserve"> </w:t>
       </w:r>
       <w:r>
-        <w:t xml:space="preserve">= VERIFIED,</w:t>
+        <w:t xml:space="preserve">= đã xác minh (VERIFIED);</w:t>
       </w:r>
       <w:r>
         <w:t xml:space="preserve"> </w:t>
@@ -358,7 +358,7 @@
         <w:t xml:space="preserve"> </w:t>
       </w:r>
       <w:r>
-        <w:t xml:space="preserve">= PARTIALLY VERIFIED,</w:t>
+        <w:t xml:space="preserve">= xác minh một phần (PARTIALLY VERIFIED);</w:t>
       </w:r>
       <w:r>
         <w:t xml:space="preserve"> </w:t>
@@ -374,16 +374,16 @@
         <w:t xml:space="preserve"> </w:t>
       </w:r>
       <w:r>
-        <w:t xml:space="preserve">= NOT VERIFIED.</w:t>
-      </w:r>
-    </w:p>
-    <w:bookmarkStart w:id="12" w:name="X676b3af9c284435bc11f7b60892cca60e63cfb5"/>
+        <w:t xml:space="preserve">= chưa xác minh được (NOT VERIFIED).</w:t>
+      </w:r>
+    </w:p>
+    <w:bookmarkStart w:id="12" w:name="X341a561fca492d201229d2112c664c6f2128032"/>
     <w:p>
       <w:pPr>
         <w:pStyle w:val="Heading3"/>
       </w:pPr>
       <w:r>
-        <w:t xml:space="preserve">4.1 Geographic Scope — N</w:t>
+        <w:t xml:space="preserve">4.1 Phạm vi địa lý (Geographic Scope) — N</w:t>
       </w:r>
     </w:p>
     <w:p>
@@ -391,10 +391,7 @@
         <w:pStyle w:val="FirstParagraph"/>
       </w:pPr>
       <w:r>
-        <w:t xml:space="preserve">Không tìm thấy quyết định chọn thành phố (ADR/decision log) trong W1 hay ở HEAD. Hiện trạng quan sát được: pipeline Overpass dùng 5 bounding box (Đà Nẵng, Hà Nội, Hội An, Nha Trang, Huế) —</w:t>
-      </w:r>
-      <w:r>
-        <w:t xml:space="preserve"> </w:t>
+        <w:t xml:space="preserve">Không tìm thấy quyết định chọn thành phố (ADR hoặc decision log) trong W1, kể cả ở nhánh hiện tại. Hiện trạng quan sát được: pipeline Overpass sử dụng 5 vùng bao (bounding box) gồm Đà Nẵng, Hà Nội, Hội An, Nha Trang và Huế (</w:t>
       </w:r>
       <w:r>
         <w:rPr>
@@ -415,10 +412,7 @@
         <w:t xml:space="preserve">ffe7b97</w:t>
       </w:r>
       <w:r>
-        <w:t xml:space="preserve"> </w:t>
-      </w:r>
-      <w:r>
-        <w:t xml:space="preserve">(01/10). Dữ liệu thực tế tập trung ở Đà Nẵng (55) và Hà Nội (50). Hạ Long: 0 POI. Phạm vi 5 box vượt giới hạn 1–2 thành phố của đề cương.</w:t>
+        <w:t xml:space="preserve">, ngày 01/10). Dữ liệu thực tế tập trung ở Đà Nẵng (55 địa điểm) và Hà Nội (50 địa điểm); Hạ Long không có địa điểm nào. Phạm vi 5 vùng vượt giới hạn 1–2 thành phố mà đề cương đề ra.</w:t>
       </w:r>
     </w:p>
     <w:p>
@@ -430,13 +424,133 @@
           <w:b/>
           <w:bCs/>
         </w:rPr>
-        <w:t xml:space="preserve">Post-W1 Scope Clarification / Scope Change:</w:t>
-      </w:r>
-      <w:r>
-        <w:t xml:space="preserve"> </w:t>
-      </w:r>
-      <w:r>
-        <w:t xml:space="preserve">hướng "Hà Nội + Hạ Long"</w:t>
+        <w:t xml:space="preserve">Làm rõ phạm vi sau W1 (Post-W1 Scope Clarification):</w:t>
+      </w:r>
+      <w:r>
+        <w:t xml:space="preserve"> </w:t>
+      </w:r>
+      <w:r>
+        <w:t xml:space="preserve">hướng "Hà Nội + Hạ Long" không có bằng chứng được quyết định trong W1 và hiện chưa được ghi nhận trong repository. Đây là định hướng sau W1, cần được ghi thành ADR khi chính thức hóa và không được tính là kết quả của W1.</w:t>
+      </w:r>
+    </w:p>
+    <w:bookmarkEnd w:id="12"/>
+    <w:bookmarkStart w:id="13" w:name="X07d73f024e9c107791192a47189bca914b19b17"/>
+    <w:p>
+      <w:pPr>
+        <w:pStyle w:val="Heading3"/>
+      </w:pPr>
+      <w:r>
+        <w:t xml:space="preserve">4.2 Nguồn dữ liệu POI — P</w:t>
+      </w:r>
+    </w:p>
+    <w:p>
+      <w:pPr>
+        <w:pStyle w:val="FirstParagraph"/>
+      </w:pPr>
+      <w:r>
+        <w:t xml:space="preserve">OpenStreetMap thông qua Overpass API được chọn làm nguồn POI chính (</w:t>
+      </w:r>
+      <w:r>
+        <w:rPr>
+          <w:rStyle w:val="VerbatimChar"/>
+        </w:rPr>
+        <w:t xml:space="preserve">docs/data/data-sources.md</w:t>
+      </w:r>
+      <w:r>
+        <w:t xml:space="preserve">,</w:t>
+      </w:r>
+      <w:r>
+        <w:t xml:space="preserve"> </w:t>
+      </w:r>
+      <w:r>
+        <w:rPr>
+          <w:rStyle w:val="VerbatimChar"/>
+        </w:rPr>
+        <w:t xml:space="preserve">data/manifests/sources.yaml</w:t>
+      </w:r>
+      <w:r>
+        <w:t xml:space="preserve">, ADR-002; các commit</w:t>
+      </w:r>
+      <w:r>
+        <w:t xml:space="preserve"> </w:t>
+      </w:r>
+      <w:r>
+        <w:rPr>
+          <w:rStyle w:val="VerbatimChar"/>
+        </w:rPr>
+        <w:t xml:space="preserve">8592aea</w:t>
+      </w:r>
+      <w:r>
+        <w:t xml:space="preserve">,</w:t>
+      </w:r>
+      <w:r>
+        <w:t xml:space="preserve"> </w:t>
+      </w:r>
+      <w:r>
+        <w:rPr>
+          <w:rStyle w:val="VerbatimChar"/>
+        </w:rPr>
+        <w:t xml:space="preserve">b5e96db</w:t>
+      </w:r>
+      <w:r>
+        <w:t xml:space="preserve">,</w:t>
+      </w:r>
+      <w:r>
+        <w:t xml:space="preserve"> </w:t>
+      </w:r>
+      <w:r>
+        <w:rPr>
+          <w:rStyle w:val="VerbatimChar"/>
+        </w:rPr>
+        <w:t xml:space="preserve">ffe7b97</w:t>
+      </w:r>
+      <w:r>
+        <w:t xml:space="preserve">). Quy trình xử lý gồm thu thập, phân tích cú pháp và hợp nhất thực thể (</w:t>
+      </w:r>
+      <w:r>
+        <w:rPr>
+          <w:rStyle w:val="VerbatimChar"/>
+        </w:rPr>
+        <w:t xml:space="preserve">data/pipelines/</w:t>
+      </w:r>
+      <w:r>
+        <w:t xml:space="preserve">). Ngày lấy dữ liệu được khai báo là 01/10/2026, tuy nhiên file dữ liệu thô không có dấu thời gian. Đợt rà soát ngày 03/10 (</w:t>
+      </w:r>
+      <w:r>
+        <w:rPr>
+          <w:rStyle w:val="VerbatimChar"/>
+        </w:rPr>
+        <w:t xml:space="preserve">2d15a64</w:t>
+      </w:r>
+      <w:r>
+        <w:t xml:space="preserve">) phát hiện 11/110 bản ghi nguồn có mã OSM không tồn tại do được nhập thủ công vào file dữ liệu thô.</w:t>
+      </w:r>
+    </w:p>
+    <w:bookmarkEnd w:id="13"/>
+    <w:bookmarkStart w:id="14" w:name="X624f259454d8e95a5ba40a900e0853caf880267"/>
+    <w:p>
+      <w:pPr>
+        <w:pStyle w:val="Heading3"/>
+      </w:pPr>
+      <w:r>
+        <w:t xml:space="preserve">4.3 License — P</w:t>
+      </w:r>
+    </w:p>
+    <w:p>
+      <w:pPr>
+        <w:pStyle w:val="FirstParagraph"/>
+      </w:pPr>
+      <w:r>
+        <w:t xml:space="preserve">Tài liệu của nhóm ghi nhận: OSM theo ODbL 1.0 (ghi công "© OpenStreetMap contributors", chia sẻ tương tự); Wikivoyage theo CC BY-SA 3.0; Open-Meteo theo CC BY 4.0 (</w:t>
+      </w:r>
+      <w:r>
+        <w:rPr>
+          <w:rStyle w:val="VerbatimChar"/>
+        </w:rPr>
+        <w:t xml:space="preserve">sources.yaml</w:t>
+      </w:r>
+      <w:r>
+        <w:t xml:space="preserve">). Báo cáo này chưa đối chiếu độc lập với trang license gốc. Với dữ liệu đánh giá (review) nội bộ,</w:t>
       </w:r>
       <w:r>
         <w:t xml:space="preserve"> </w:t>
@@ -446,23 +560,32 @@
           <w:b/>
           <w:bCs/>
         </w:rPr>
-        <w:t xml:space="preserve">không</w:t>
-      </w:r>
-      <w:r>
-        <w:t xml:space="preserve"> </w:t>
-      </w:r>
-      <w:r>
-        <w:t xml:space="preserve">có bằng chứng được quyết định trong W1 và cũng chưa có tài liệu ghi nhận trong repository. Đây là định hướng sau W1, cần ghi ADR khi chính thức hóa; không được tính là kết quả W1.</w:t>
-      </w:r>
-    </w:p>
-    <w:bookmarkEnd w:id="12"/>
-    <w:bookmarkStart w:id="13" w:name="X9651bda3fbbaf9a92ee1b52075e54aa26b84f2f"/>
+        <w:t xml:space="preserve">trạng thái license: chưa xác minh (NOT VERIFIED)</w:t>
+      </w:r>
+      <w:r>
+        <w:t xml:space="preserve">; đây là dữ liệu mẫu tự tạo và nguồn UIT-VSFC được trích dẫn trước đó đã được nhóm rút lại ở commit</w:t>
+      </w:r>
+      <w:r>
+        <w:t xml:space="preserve"> </w:t>
+      </w:r>
+      <w:r>
+        <w:rPr>
+          <w:rStyle w:val="VerbatimChar"/>
+        </w:rPr>
+        <w:t xml:space="preserve">4944fae</w:t>
+      </w:r>
+      <w:r>
+        <w:t xml:space="preserve">.</w:t>
+      </w:r>
+    </w:p>
+    <w:bookmarkEnd w:id="14"/>
+    <w:bookmarkStart w:id="15" w:name="X9817f22f261bbe40fe22e5dcb626a840728b52d"/>
     <w:p>
       <w:pPr>
         <w:pStyle w:val="Heading3"/>
       </w:pPr>
       <w:r>
-        <w:t xml:space="preserve">4.2 POI Sources — P</w:t>
+        <w:t xml:space="preserve">4.4 Phạm vi MVP — N</w:t>
       </w:r>
     </w:p>
     <w:p>
@@ -470,73 +593,73 @@
         <w:pStyle w:val="FirstParagraph"/>
       </w:pPr>
       <w:r>
-        <w:t xml:space="preserve">OpenStreetMap qua Overpass API được chọn và triển khai:</w:t>
-      </w:r>
-      <w:r>
-        <w:t xml:space="preserve"> </w:t>
-      </w:r>
-      <w:r>
-        <w:rPr>
-          <w:rStyle w:val="VerbatimChar"/>
-        </w:rPr>
-        <w:t xml:space="preserve">docs/data/data-sources.md</w:t>
-      </w:r>
-      <w:r>
-        <w:t xml:space="preserve">,</w:t>
-      </w:r>
-      <w:r>
-        <w:t xml:space="preserve"> </w:t>
-      </w:r>
-      <w:r>
-        <w:rPr>
-          <w:rStyle w:val="VerbatimChar"/>
-        </w:rPr>
-        <w:t xml:space="preserve">data/manifests/sources.yaml</w:t>
-      </w:r>
-      <w:r>
-        <w:t xml:space="preserve">, ADR-002 (</w:t>
-      </w:r>
-      <w:r>
-        <w:rPr>
-          <w:rStyle w:val="VerbatimChar"/>
-        </w:rPr>
-        <w:t xml:space="preserve">8592aea</w:t>
-      </w:r>
-      <w:r>
-        <w:t xml:space="preserve">,</w:t>
-      </w:r>
-      <w:r>
-        <w:t xml:space="preserve"> </w:t>
-      </w:r>
-      <w:r>
-        <w:rPr>
-          <w:rStyle w:val="VerbatimChar"/>
-        </w:rPr>
-        <w:t xml:space="preserve">b5e96db</w:t>
-      </w:r>
-      <w:r>
-        <w:t xml:space="preserve">,</w:t>
-      </w:r>
-      <w:r>
-        <w:t xml:space="preserve"> </w:t>
-      </w:r>
-      <w:r>
-        <w:rPr>
-          <w:rStyle w:val="VerbatimChar"/>
-        </w:rPr>
-        <w:t xml:space="preserve">ffe7b97</w:t>
-      </w:r>
-      <w:r>
-        <w:t xml:space="preserve">). Pipeline: collect → parse → entity resolution (</w:t>
-      </w:r>
-      <w:r>
-        <w:rPr>
-          <w:rStyle w:val="VerbatimChar"/>
-        </w:rPr>
-        <w:t xml:space="preserve">data/pipelines/</w:t>
-      </w:r>
-      <w:r>
-        <w:t xml:space="preserve">). Ngày snapshot khai báo 01/10/2026, file raw không có timestamp. Kiểm tra ngày 03/10 (</w:t>
+        <w:t xml:space="preserve">Không có ADR, issue hay tài liệu nào chốt MVP trong W1. Bằng chứng gián tiếp duy nhất là bộ công nghệ được cố định trong</w:t>
+      </w:r>
+      <w:r>
+        <w:t xml:space="preserve"> </w:t>
+      </w:r>
+      <w:r>
+        <w:rPr>
+          <w:rStyle w:val="VerbatimChar"/>
+        </w:rPr>
+        <w:t xml:space="preserve">AGENTS.md</w:t>
+      </w:r>
+      <w:r>
+        <w:t xml:space="preserve"> </w:t>
+      </w:r>
+      <w:r>
+        <w:t xml:space="preserve">(</w:t>
+      </w:r>
+      <w:r>
+        <w:rPr>
+          <w:rStyle w:val="VerbatimChar"/>
+        </w:rPr>
+        <w:t xml:space="preserve">9b36f9d</w:t>
+      </w:r>
+      <w:r>
+        <w:t xml:space="preserve">). Đối chiếu với ba năng lực nghiên cứu của đề cương tại cuối W1: lập lịch trình bằng AI mới đạt một phần (chạy được với dữ liệu giả lập, nhưng lỗi khi chạy thật ngày 03/10); gợi ý mới có mô hình cơ sở MostPop; ghép bạn đồng hành chưa có mã nguồn.</w:t>
+      </w:r>
+    </w:p>
+    <w:bookmarkEnd w:id="15"/>
+    <w:bookmarkStart w:id="16" w:name="X5a679a77343ad24771c3c335a047a091db14c44"/>
+    <w:p>
+      <w:pPr>
+        <w:pStyle w:val="Heading3"/>
+      </w:pPr>
+      <w:r>
+        <w:t xml:space="preserve">4.5 Tập dữ liệu POI thử nghiệm (Pilot Dataset) — V (về sự tồn tại), P (về chất lượng)</w:t>
+      </w:r>
+    </w:p>
+    <w:p>
+      <w:pPr>
+        <w:pStyle w:val="FirstParagraph"/>
+      </w:pPr>
+      <w:r>
+        <w:rPr>
+          <w:rStyle w:val="VerbatimChar"/>
+        </w:rPr>
+        <w:t xml:space="preserve">data/curated/places_canonical.json</w:t>
+      </w:r>
+      <w:r>
+        <w:t xml:space="preserve"> </w:t>
+      </w:r>
+      <w:r>
+        <w:t xml:space="preserve">gồm 108 địa điểm, 110 bản ghi nguồn (đều từ</w:t>
+      </w:r>
+      <w:r>
+        <w:t xml:space="preserve"> </w:t>
+      </w:r>
+      <w:r>
+        <w:rPr>
+          <w:rStyle w:val="VerbatimChar"/>
+        </w:rPr>
+        <w:t xml:space="preserve">osm</w:t>
+      </w:r>
+      <w:r>
+        <w:t xml:space="preserve">), 6 nhóm danh mục (cafe 55, hotel 25, restaurant 15, attraction 9, culture 3, beach 1) và 13 trường dữ liệu. Số liệu được đo lại ngày 05/10 trên bản lưu tại</w:t>
+      </w:r>
+      <w:r>
+        <w:t xml:space="preserve"> </w:t>
       </w:r>
       <w:r>
         <w:rPr>
@@ -545,17 +668,68 @@
         <w:t xml:space="preserve">2d15a64</w:t>
       </w:r>
       <w:r>
-        <w:t xml:space="preserve">) cho thấy 11/110 bản ghi nguồn có OSM ID không có thật (do nhập tay vào file raw).</w:t>
-      </w:r>
-    </w:p>
-    <w:bookmarkEnd w:id="13"/>
-    <w:bookmarkStart w:id="14" w:name="X624f259454d8e95a5ba40a900e0853caf880267"/>
+        <w:t xml:space="preserve"> </w:t>
+      </w:r>
+      <w:r>
+        <w:t xml:space="preserve">(</w:t>
+      </w:r>
+      <w:r>
+        <w:rPr>
+          <w:rStyle w:val="VerbatimChar"/>
+        </w:rPr>
+        <w:t xml:space="preserve">evidence/dataset-summary.txt</w:t>
+      </w:r>
+      <w:r>
+        <w:t xml:space="preserve">): không thiếu tọa độ, không có tọa độ ngoài lãnh thổ Việt Nam, không có bản ghi trùng. Tuy nhiên, cả 108 địa điểm đều mang điểm đánh giá mặc định 4,5 (số lượt đánh giá bằng 0); 66/108 địa chỉ chỉ là giá trị tạm; không có mô tả và không có giờ mở cửa; trường</w:t>
+      </w:r>
+      <w:r>
+        <w:t xml:space="preserve"> </w:t>
+      </w:r>
+      <w:r>
+        <w:rPr>
+          <w:rStyle w:val="VerbatimChar"/>
+        </w:rPr>
+        <w:t xml:space="preserve">city</w:t>
+      </w:r>
+      <w:r>
+        <w:t xml:space="preserve"> </w:t>
+      </w:r>
+      <w:r>
+        <w:t xml:space="preserve">dùng hai kiểu nhãn khác nhau (</w:t>
+      </w:r>
+      <w:r>
+        <w:rPr>
+          <w:rStyle w:val="VerbatimChar"/>
+        </w:rPr>
+        <w:t xml:space="preserve">da_nang</w:t>
+      </w:r>
+      <w:r>
+        <w:t xml:space="preserve"> </w:t>
+      </w:r>
+      <w:r>
+        <w:t xml:space="preserve">và</w:t>
+      </w:r>
+      <w:r>
+        <w:t xml:space="preserve"> </w:t>
+      </w:r>
+      <w:r>
+        <w:rPr>
+          <w:rStyle w:val="VerbatimChar"/>
+        </w:rPr>
+        <w:t xml:space="preserve">Đà Nẵng</w:t>
+      </w:r>
+      <w:r>
+        <w:t xml:space="preserve">).</w:t>
+      </w:r>
+    </w:p>
+    <w:bookmarkEnd w:id="16"/>
+    <w:bookmarkStart w:id="17" w:name="X4cd7e7c86964ef0aeb1e9146904d0d963ae9c3f"/>
     <w:p>
       <w:pPr>
         <w:pStyle w:val="Heading3"/>
       </w:pPr>
       <w:r>
-        <w:t xml:space="preserve">4.3 License — P</w:t>
+        <w:t xml:space="preserve">4.6 Repository và quản lý dự án — P</w:t>
       </w:r>
     </w:p>
     <w:p>
@@ -563,16 +737,49 @@
         <w:pStyle w:val="FirstParagraph"/>
       </w:pPr>
       <w:r>
-        <w:t xml:space="preserve">Tài liệu ghi OSM = ODbL 1.0 (attribution "© OpenStreetMap contributors", share-alike); Wikivoyage = CC BY-SA 3.0; Open-Meteo = CC BY 4.0 (</w:t>
-      </w:r>
-      <w:r>
-        <w:rPr>
-          <w:rStyle w:val="VerbatimChar"/>
-        </w:rPr>
-        <w:t xml:space="preserve">sources.yaml</w:t>
-      </w:r>
-      <w:r>
-        <w:t xml:space="preserve">). Chưa đối chiếu độc lập với trang license gốc trong task này. Dữ liệu review nội bộ:</w:t>
+        <w:t xml:space="preserve">Nhóm có repository GitHub riêng</w:t>
+      </w:r>
+      <w:r>
+        <w:t xml:space="preserve"> </w:t>
+      </w:r>
+      <w:r>
+        <w:rPr>
+          <w:rStyle w:val="VerbatimChar"/>
+        </w:rPr>
+        <w:t xml:space="preserve">namnh102/wanderai</w:t>
+      </w:r>
+      <w:r>
+        <w:t xml:space="preserve">, tệp quy tắc</w:t>
+      </w:r>
+      <w:r>
+        <w:t xml:space="preserve"> </w:t>
+      </w:r>
+      <w:r>
+        <w:rPr>
+          <w:rStyle w:val="VerbatimChar"/>
+        </w:rPr>
+        <w:t xml:space="preserve">AGENTS.md</w:t>
+      </w:r>
+      <w:r>
+        <w:t xml:space="preserve"> </w:t>
+      </w:r>
+      <w:r>
+        <w:t xml:space="preserve">và</w:t>
+      </w:r>
+      <w:r>
+        <w:t xml:space="preserve"> </w:t>
+      </w:r>
+      <w:r>
+        <w:rPr>
+          <w:rStyle w:val="VerbatimChar"/>
+        </w:rPr>
+        <w:t xml:space="preserve">CONTRIBUTING.md</w:t>
+      </w:r>
+      <w:r>
+        <w:t xml:space="preserve"> </w:t>
+      </w:r>
+      <w:r>
+        <w:t xml:space="preserve">(29/09), các nhánh theo tính năng, và 31 commit trong khoảng thời gian W1 (20 commit không tính merge). Repository</w:t>
       </w:r>
       <w:r>
         <w:t xml:space="preserve"> </w:t>
@@ -582,52 +789,7 @@
           <w:b/>
           <w:bCs/>
         </w:rPr>
-        <w:t xml:space="preserve">LICENSE STATUS: NOT VERIFIED</w:t>
-      </w:r>
-      <w:r>
-        <w:t xml:space="preserve"> </w:t>
-      </w:r>
-      <w:r>
-        <w:t xml:space="preserve">(fixture tổng hợp; trích dẫn UIT-VSFC trước đó đã được rút lại ở</w:t>
-      </w:r>
-      <w:r>
-        <w:t xml:space="preserve"> </w:t>
-      </w:r>
-      <w:r>
-        <w:rPr>
-          <w:rStyle w:val="VerbatimChar"/>
-        </w:rPr>
-        <w:t xml:space="preserve">4944fae</w:t>
-      </w:r>
-      <w:r>
-        <w:t xml:space="preserve">).</w:t>
-      </w:r>
-    </w:p>
-    <w:bookmarkEnd w:id="14"/>
-    <w:bookmarkStart w:id="15" w:name="Xffa1e4d2ab003e78dffb0f26d02874f86c583db"/>
-    <w:p>
-      <w:pPr>
-        <w:pStyle w:val="Heading3"/>
-      </w:pPr>
-      <w:r>
-        <w:t xml:space="preserve">4.4 MVP Scope — N</w:t>
-      </w:r>
-    </w:p>
-    <w:p>
-      <w:pPr>
-        <w:pStyle w:val="FirstParagraph"/>
-      </w:pPr>
-      <w:r>
-        <w:t xml:space="preserve">Không có ADR/issue/tài liệu nào khóa MVP trong W1. Có bằng chứng gián tiếp: stack kỹ thuật cố định trong</w:t>
-      </w:r>
-      <w:r>
-        <w:t xml:space="preserve"> </w:t>
-      </w:r>
-      <w:r>
-        <w:rPr>
-          <w:rStyle w:val="VerbatimChar"/>
-        </w:rPr>
-        <w:t xml:space="preserve">AGENTS.md</w:t>
+        <w:t xml:space="preserve">không có Issue, Pull Request, Milestone hay tag</w:t>
       </w:r>
       <w:r>
         <w:t xml:space="preserve"> </w:t>
@@ -639,197 +801,28 @@
         <w:rPr>
           <w:rStyle w:val="VerbatimChar"/>
         </w:rPr>
-        <w:t xml:space="preserve">9b36f9d</w:t>
-      </w:r>
-      <w:r>
-        <w:t xml:space="preserve">). Theo ba năng lực của đề cương tại cuối W1: lập lịch AI — một phần (chạy được với mock, lỗi khi chạy thật ngày 03/10); gợi ý — chỉ có baseline MostPop; ghép bạn đồng hành — chưa có mã.</w:t>
-      </w:r>
-    </w:p>
-    <w:bookmarkEnd w:id="15"/>
-    <w:bookmarkStart w:id="16" w:name="X12600410daa1e1662b72c9767c5e8a4c7ba0208"/>
-    <w:p>
-      <w:pPr>
-        <w:pStyle w:val="Heading3"/>
-      </w:pPr>
-      <w:r>
-        <w:t xml:space="preserve">4.5 Pilot Dataset — V (tồn tại), P (chất lượng)</w:t>
-      </w:r>
-    </w:p>
-    <w:p>
-      <w:pPr>
-        <w:pStyle w:val="FirstParagraph"/>
-      </w:pPr>
-      <w:r>
-        <w:rPr>
-          <w:rStyle w:val="VerbatimChar"/>
-        </w:rPr>
-        <w:t xml:space="preserve">data/curated/places_canonical.json</w:t>
-      </w:r>
-      <w:r>
-        <w:t xml:space="preserve">: 108 địa điểm, 110 bản ghi nguồn (đều</w:t>
-      </w:r>
-      <w:r>
-        <w:t xml:space="preserve"> </w:t>
-      </w:r>
-      <w:r>
-        <w:rPr>
-          <w:rStyle w:val="VerbatimChar"/>
-        </w:rPr>
-        <w:t xml:space="preserve">osm</w:t>
-      </w:r>
-      <w:r>
-        <w:t xml:space="preserve">), 6 category (cafe 55, hotel 25, restaurant 15, attraction 9, culture 3, beach 1), 13 trường. Đo ngày 05/10 trên bản lưu tại</w:t>
-      </w:r>
-      <w:r>
-        <w:t xml:space="preserve"> </w:t>
-      </w:r>
-      <w:r>
-        <w:rPr>
-          <w:rStyle w:val="VerbatimChar"/>
-        </w:rPr>
-        <w:t xml:space="preserve">2d15a64</w:t>
-      </w:r>
-      <w:r>
-        <w:t xml:space="preserve"> </w:t>
-      </w:r>
-      <w:r>
-        <w:t xml:space="preserve">(</w:t>
-      </w:r>
-      <w:r>
-        <w:rPr>
-          <w:rStyle w:val="VerbatimChar"/>
-        </w:rPr>
-        <w:t xml:space="preserve">evidence/dataset-summary.txt</w:t>
-      </w:r>
-      <w:r>
-        <w:t xml:space="preserve">): 0 thiếu tọa độ, 0 tọa độ ngoài lãnh thổ, 0 trùng; nhưng 108/108 rating là mặc định 4.5 (review_count 0), 66/108 địa chỉ là placeholder, 0 mô tả, không có opening hours; trường</w:t>
-      </w:r>
-      <w:r>
-        <w:t xml:space="preserve"> </w:t>
-      </w:r>
-      <w:r>
-        <w:rPr>
-          <w:rStyle w:val="VerbatimChar"/>
-        </w:rPr>
-        <w:t xml:space="preserve">city</w:t>
-      </w:r>
-      <w:r>
-        <w:t xml:space="preserve"> </w:t>
-      </w:r>
-      <w:r>
-        <w:t xml:space="preserve">dùng hai kiểu nhãn (</w:t>
-      </w:r>
-      <w:r>
-        <w:rPr>
-          <w:rStyle w:val="VerbatimChar"/>
-        </w:rPr>
-        <w:t xml:space="preserve">da_nang</w:t>
-      </w:r>
-      <w:r>
-        <w:t xml:space="preserve"> </w:t>
-      </w:r>
-      <w:r>
-        <w:t xml:space="preserve">/</w:t>
-      </w:r>
-      <w:r>
-        <w:t xml:space="preserve"> </w:t>
-      </w:r>
-      <w:r>
-        <w:rPr>
-          <w:rStyle w:val="VerbatimChar"/>
-        </w:rPr>
-        <w:t xml:space="preserve">Đà Nẵng</w:t>
-      </w:r>
-      <w:r>
-        <w:t xml:space="preserve">).</w:t>
-      </w:r>
-    </w:p>
-    <w:bookmarkEnd w:id="16"/>
-    <w:bookmarkStart w:id="17" w:name="X95e17fd77f49e531b847ac4be71157aeeb8ea63"/>
-    <w:p>
-      <w:pPr>
-        <w:pStyle w:val="Heading3"/>
-      </w:pPr>
-      <w:r>
-        <w:t xml:space="preserve">4.6 Repository / Project Management — P</w:t>
-      </w:r>
-    </w:p>
-    <w:p>
-      <w:pPr>
-        <w:pStyle w:val="FirstParagraph"/>
-      </w:pPr>
-      <w:r>
-        <w:t xml:space="preserve">Repository GitHub riêng</w:t>
-      </w:r>
-      <w:r>
-        <w:t xml:space="preserve"> </w:t>
-      </w:r>
-      <w:r>
-        <w:rPr>
-          <w:rStyle w:val="VerbatimChar"/>
-        </w:rPr>
-        <w:t xml:space="preserve">namnh102/wanderai</w:t>
-      </w:r>
-      <w:r>
-        <w:t xml:space="preserve"> </w:t>
-      </w:r>
-      <w:r>
-        <w:t xml:space="preserve">có</w:t>
-      </w:r>
-      <w:r>
-        <w:t xml:space="preserve"> </w:t>
-      </w:r>
-      <w:r>
-        <w:rPr>
-          <w:rStyle w:val="VerbatimChar"/>
-        </w:rPr>
-        <w:t xml:space="preserve">AGENTS.md</w:t>
-      </w:r>
-      <w:r>
-        <w:t xml:space="preserve">,</w:t>
-      </w:r>
-      <w:r>
-        <w:t xml:space="preserve"> </w:t>
-      </w:r>
-      <w:r>
-        <w:rPr>
-          <w:rStyle w:val="VerbatimChar"/>
-        </w:rPr>
-        <w:t xml:space="preserve">CONTRIBUTING.md</w:t>
-      </w:r>
-      <w:r>
-        <w:t xml:space="preserve"> </w:t>
-      </w:r>
-      <w:r>
-        <w:t xml:space="preserve">(29/09), nhánh theo tính năng, 31 commit trong cửa sổ W1 (20 không tính merge).</w:t>
-      </w:r>
-      <w:r>
-        <w:t xml:space="preserve"> </w:t>
-      </w:r>
-      <w:r>
-        <w:rPr>
-          <w:b/>
-          <w:bCs/>
-        </w:rPr>
-        <w:t xml:space="preserve">Không có Issue, PR, Milestone, tag</w:t>
-      </w:r>
-      <w:r>
-        <w:t xml:space="preserve"> </w:t>
-      </w:r>
-      <w:r>
-        <w:t xml:space="preserve">(</w:t>
-      </w:r>
-      <w:r>
-        <w:rPr>
-          <w:rStyle w:val="VerbatimChar"/>
-        </w:rPr>
-        <w:t xml:space="preserve">gh issue/pr list</w:t>
-      </w:r>
-      <w:r>
-        <w:t xml:space="preserve"> </w:t>
-      </w:r>
-      <w:r>
-        <w:t xml:space="preserve">rỗng) — chưa đạt yêu cầu mục 10 đề cương.</w:t>
+        <w:t xml:space="preserve">gh issue list</w:t>
+      </w:r>
+      <w:r>
+        <w:t xml:space="preserve"> </w:t>
+      </w:r>
+      <w:r>
+        <w:t xml:space="preserve">và</w:t>
+      </w:r>
+      <w:r>
+        <w:t xml:space="preserve"> </w:t>
+      </w:r>
+      <w:r>
+        <w:rPr>
+          <w:rStyle w:val="VerbatimChar"/>
+        </w:rPr>
+        <w:t xml:space="preserve">gh pr list</w:t>
+      </w:r>
+      <w:r>
+        <w:t xml:space="preserve"> </w:t>
+      </w:r>
+      <w:r>
+        <w:t xml:space="preserve">đều trả về rỗng), chưa đáp ứng yêu cầu quản lý công việc tại mục 10 của đề cương.</w:t>
       </w:r>
     </w:p>
     <w:bookmarkEnd w:id="17"/>
@@ -856,13 +849,13 @@
           <w:b/>
           <w:bCs/>
         </w:rPr>
-        <w:t xml:space="preserve">COMPLETED:</w:t>
-      </w:r>
-      <w:r>
-        <w:t xml:space="preserve"> </w:t>
-      </w:r>
-      <w:r>
-        <w:t xml:space="preserve">repository có quy tắc làm việc; pipeline OSM tái lập được; pilot dataset 108 POI tồn tại và truy vết được tới commit.</w:t>
+        <w:t xml:space="preserve">Hoàn thành:</w:t>
+      </w:r>
+      <w:r>
+        <w:t xml:space="preserve"> </w:t>
+      </w:r>
+      <w:r>
+        <w:t xml:space="preserve">repository có quy tắc làm việc; pipeline OSM chạy lại được; pilot dataset 108 POI tồn tại và truy vết được tới commit.</w:t>
       </w:r>
     </w:p>
     <w:p>
@@ -878,13 +871,13 @@
           <w:b/>
           <w:bCs/>
         </w:rPr>
-        <w:t xml:space="preserve">PARTIAL:</w:t>
-      </w:r>
-      <w:r>
-        <w:t xml:space="preserve"> </w:t>
-      </w:r>
-      <w:r>
-        <w:t xml:space="preserve">nguồn POI/license (đã ghi tài liệu, chưa kiểm tra độc lập, 11 ID sai); Data/source card (có</w:t>
+        <w:t xml:space="preserve">Hoàn thành một phần:</w:t>
+      </w:r>
+      <w:r>
+        <w:t xml:space="preserve"> </w:t>
+      </w:r>
+      <w:r>
+        <w:t xml:space="preserve">nguồn POI và license (đã có tài liệu nhưng chưa kiểm tra độc lập, còn 11 mã nguồn sai); Data/source card (có</w:t>
       </w:r>
       <w:r>
         <w:t xml:space="preserve"> </w:t>
@@ -899,7 +892,7 @@
         <w:t xml:space="preserve"> </w:t>
       </w:r>
       <w:r>
-        <w:t xml:space="preserve">+</w:t>
+        <w:t xml:space="preserve">và</w:t>
       </w:r>
       <w:r>
         <w:t xml:space="preserve"> </w:t>
@@ -914,7 +907,7 @@
         <w:t xml:space="preserve"> </w:t>
       </w:r>
       <w:r>
-        <w:t xml:space="preserve">gốc; thẻ hợp nhất là bản</w:t>
+        <w:t xml:space="preserve">gốc, thẻ hợp nhất mới là bản</w:t>
       </w:r>
       <w:r>
         <w:t xml:space="preserve"> </w:t>
@@ -924,10 +917,10 @@
           <w:b/>
           <w:bCs/>
         </w:rPr>
-        <w:t xml:space="preserve">RECONSTRUCTED</w:t>
-      </w:r>
-      <w:r>
-        <w:t xml:space="preserve">); quản lý dự án.</w:t>
+        <w:t xml:space="preserve">dựng lại</w:t>
+      </w:r>
+      <w:r>
+        <w:t xml:space="preserve">, đánh dấu RECONSTRUCTED); quản lý dự án.</w:t>
       </w:r>
     </w:p>
     <w:p>
@@ -943,13 +936,13 @@
           <w:b/>
           <w:bCs/>
         </w:rPr>
-        <w:t xml:space="preserve">NOT COMPLETED:</w:t>
-      </w:r>
-      <w:r>
-        <w:t xml:space="preserve"> </w:t>
-      </w:r>
-      <w:r>
-        <w:t xml:space="preserve">Issue/PR/Milestone; cross-review giữa hai thành viên.</w:t>
+        <w:t xml:space="preserve">Chưa hoàn thành:</w:t>
+      </w:r>
+      <w:r>
+        <w:t xml:space="preserve"> </w:t>
+      </w:r>
+      <w:r>
+        <w:t xml:space="preserve">Issue, Pull Request, Milestone; kiểm tra chéo mã nguồn giữa hai thành viên.</w:t>
       </w:r>
     </w:p>
     <w:p>
@@ -965,13 +958,13 @@
           <w:b/>
           <w:bCs/>
         </w:rPr>
-        <w:t xml:space="preserve">NOT VERIFIED:</w:t>
-      </w:r>
-      <w:r>
-        <w:t xml:space="preserve"> </w:t>
-      </w:r>
-      <w:r>
-        <w:t xml:space="preserve">quyết định city scope; khóa MVP; đóng góp của Nguyễn Duy Khánh.</w:t>
+        <w:t xml:space="preserve">Chưa xác minh được:</w:t>
+      </w:r>
+      <w:r>
+        <w:t xml:space="preserve"> </w:t>
+      </w:r>
+      <w:r>
+        <w:t xml:space="preserve">quyết định phạm vi thành phố; việc chốt MVP; phần đóng góp của từng thành viên qua Git.</w:t>
       </w:r>
     </w:p>
     <w:p>
@@ -983,23 +976,10 @@
         </w:numPr>
       </w:pPr>
       <w:r>
-        <w:t xml:space="preserve">Công việc nằm trong khoảng 27/09–03/10 nhưng</w:t>
-      </w:r>
-      <w:r>
-        <w:t xml:space="preserve"> </w:t>
-      </w:r>
-      <w:r>
-        <w:rPr>
-          <w:b/>
-          <w:bCs/>
-        </w:rPr>
-        <w:t xml:space="preserve">ngoài kế hoạch W1</w:t>
-      </w:r>
-      <w:r>
-        <w:t xml:space="preserve"> </w:t>
-      </w:r>
-      <w:r>
-        <w:t xml:space="preserve">(không tính là kết quả W1): auth, AI chat, trip CRUD, AI planner, RAG/MostPop, màn hình bản đồ (</w:t>
+        <w:t xml:space="preserve">Các công việc diễn ra trong khoảng 27/09–03/10 nhưng nằm ngoài kế hoạch W1 và không được tính là kết quả W1: xác thực người dùng, trò chuyện AI, quản lý chuyến đi, AI planner bản đầu, RAG và MostPop, màn hình bản đồ (từ</w:t>
+      </w:r>
+      <w:r>
+        <w:t xml:space="preserve"> </w:t>
       </w:r>
       <w:r>
         <w:rPr>
@@ -1008,7 +988,13 @@
         <w:t xml:space="preserve">d02cee7</w:t>
       </w:r>
       <w:r>
-        <w:t xml:space="preserve">…</w:t>
+        <w:t xml:space="preserve"> </w:t>
+      </w:r>
+      <w:r>
+        <w:t xml:space="preserve">đến</w:t>
+      </w:r>
+      <w:r>
+        <w:t xml:space="preserve"> </w:t>
       </w:r>
       <w:r>
         <w:rPr>
@@ -1050,7 +1036,7 @@
         <w:t xml:space="preserve"> </w:t>
       </w:r>
       <w:r>
-        <w:t xml:space="preserve">(RECONSTRUCTED 05/10/2026) và các file gốc:</w:t>
+        <w:t xml:space="preserve">(bản dựng lại ngày 05/10/2026) và các tài liệu gốc:</w:t>
       </w:r>
       <w:r>
         <w:t xml:space="preserve"> </w:t>
@@ -1090,13 +1076,13 @@
       </w:r>
     </w:p>
     <w:bookmarkEnd w:id="20"/>
-    <w:bookmarkStart w:id="21" w:name="Xfd88de17097e911a8de46ce2ee9b35a26eaa73f"/>
+    <w:bookmarkStart w:id="21" w:name="X689b12c789a532273115ad514ad0a244b97c032"/>
     <w:p>
       <w:pPr>
         <w:pStyle w:val="Heading2"/>
       </w:pPr>
       <w:r>
-        <w:t xml:space="preserve">7. Planned — Done — Evidence — Problems — Next Week</w:t>
+        <w:t xml:space="preserve">7. Bảng Planned — Done — Evidence — Problems — Next Week</w:t>
       </w:r>
     </w:p>
     <w:tbl>
@@ -1180,18 +1166,18 @@
               <w:pStyle w:val="Compact"/>
             </w:pPr>
             <w:r>
-              <w:t xml:space="preserve">City scope</w:t>
-            </w:r>
-          </w:p>
-        </w:tc>
-        <w:tc>
-          <w:tcPr/>
-          <w:p>
-            <w:pPr>
-              <w:pStyle w:val="Compact"/>
-            </w:pPr>
-            <w:r>
-              <w:t xml:space="preserve">Không xác nhận (N)</w:t>
+              <w:t xml:space="preserve">Chọn phạm vi thành phố</w:t>
+            </w:r>
+          </w:p>
+        </w:tc>
+        <w:tc>
+          <w:tcPr/>
+          <w:p>
+            <w:pPr>
+              <w:pStyle w:val="Compact"/>
+            </w:pPr>
+            <w:r>
+              <w:t xml:space="preserve">Chưa xác minh (N)</w:t>
             </w:r>
           </w:p>
         </w:tc>
@@ -1216,18 +1202,18 @@
               <w:pStyle w:val="Compact"/>
             </w:pPr>
             <w:r>
-              <w:t xml:space="preserve">Không có ADR; 5 box &gt; 1–2 thành phố</w:t>
-            </w:r>
-          </w:p>
-        </w:tc>
-        <w:tc>
-          <w:tcPr/>
-          <w:p>
-            <w:pPr>
-              <w:pStyle w:val="Compact"/>
-            </w:pPr>
-            <w:r>
-              <w:t xml:space="preserve">Ghi ADR scope</w:t>
+              <w:t xml:space="preserve">Không có ADR; 5 vùng vượt giới hạn 1–2 thành phố</w:t>
+            </w:r>
+          </w:p>
+        </w:tc>
+        <w:tc>
+          <w:tcPr/>
+          <w:p>
+            <w:pPr>
+              <w:pStyle w:val="Compact"/>
+            </w:pPr>
+            <w:r>
+              <w:t xml:space="preserve">Ghi ADR phạm vi</w:t>
             </w:r>
           </w:p>
         </w:tc>
@@ -1240,7 +1226,7 @@
               <w:pStyle w:val="Compact"/>
             </w:pPr>
             <w:r>
-              <w:t xml:space="preserve">POI source</w:t>
+              <w:t xml:space="preserve">Nguồn POI</w:t>
             </w:r>
           </w:p>
         </w:tc>
@@ -1288,18 +1274,18 @@
               <w:pStyle w:val="Compact"/>
             </w:pPr>
             <w:r>
-              <w:t xml:space="preserve">11 ID không thật; snapshot không có timestamp</w:t>
-            </w:r>
-          </w:p>
-        </w:tc>
-        <w:tc>
-          <w:tcPr/>
-          <w:p>
-            <w:pPr>
-              <w:pStyle w:val="Compact"/>
-            </w:pPr>
-            <w:r>
-              <w:t xml:space="preserve">Làm sạch, ghi timestamp</w:t>
+              <w:t xml:space="preserve">11 mã nguồn sai; dữ liệu thô không có dấu thời gian</w:t>
+            </w:r>
+          </w:p>
+        </w:tc>
+        <w:tc>
+          <w:tcPr/>
+          <w:p>
+            <w:pPr>
+              <w:pStyle w:val="Compact"/>
+            </w:pPr>
+            <w:r>
+              <w:t xml:space="preserve">Làm sạch, ghi ngày snapshot</w:t>
             </w:r>
           </w:p>
         </w:tc>
@@ -1323,7 +1309,7 @@
               <w:pStyle w:val="Compact"/>
             </w:pPr>
             <w:r>
-              <w:t xml:space="preserve">Ghi tài liệu (P)</w:t>
+              <w:t xml:space="preserve">Đã ghi tài liệu (P)</w:t>
             </w:r>
           </w:p>
         </w:tc>
@@ -1348,7 +1334,7 @@
               <w:pStyle w:val="Compact"/>
             </w:pPr>
             <w:r>
-              <w:t xml:space="preserve">Chưa đối chiếu độc lập; review license N</w:t>
+              <w:t xml:space="preserve">Chưa đối chiếu độc lập; license dữ liệu review chưa xác minh</w:t>
             </w:r>
           </w:p>
         </w:tc>
@@ -1372,18 +1358,18 @@
               <w:pStyle w:val="Compact"/>
             </w:pPr>
             <w:r>
-              <w:t xml:space="preserve">MVP</w:t>
-            </w:r>
-          </w:p>
-        </w:tc>
-        <w:tc>
-          <w:tcPr/>
-          <w:p>
-            <w:pPr>
-              <w:pStyle w:val="Compact"/>
-            </w:pPr>
-            <w:r>
-              <w:t xml:space="preserve">Không xác nhận (N)</w:t>
+              <w:t xml:space="preserve">Chốt MVP</w:t>
+            </w:r>
+          </w:p>
+        </w:tc>
+        <w:tc>
+          <w:tcPr/>
+          <w:p>
+            <w:pPr>
+              <w:pStyle w:val="Compact"/>
+            </w:pPr>
+            <w:r>
+              <w:t xml:space="preserve">Chưa xác minh (N)</w:t>
             </w:r>
           </w:p>
         </w:tc>
@@ -1419,7 +1405,7 @@
               <w:pStyle w:val="Compact"/>
             </w:pPr>
             <w:r>
-              <w:t xml:space="preserve">Khóa MVP bằng ADR</w:t>
+              <w:t xml:space="preserve">Chốt MVP bằng ADR</w:t>
             </w:r>
           </w:p>
         </w:tc>
@@ -1503,7 +1489,7 @@
               <w:pStyle w:val="Compact"/>
             </w:pPr>
             <w:r>
-              <w:t xml:space="preserve">Có (P)</w:t>
+              <w:t xml:space="preserve">Đã có (P)</w:t>
             </w:r>
           </w:p>
         </w:tc>
@@ -1531,18 +1517,18 @@
               <w:pStyle w:val="Compact"/>
             </w:pPr>
             <w:r>
-              <w:t xml:space="preserve">Không Issue/PR</w:t>
-            </w:r>
-          </w:p>
-        </w:tc>
-        <w:tc>
-          <w:tcPr/>
-          <w:p>
-            <w:pPr>
-              <w:pStyle w:val="Compact"/>
-            </w:pPr>
-            <w:r>
-              <w:t xml:space="preserve">Tạo Issue/Milestone, PR</w:t>
+              <w:t xml:space="preserve">Không có Issue/PR</w:t>
+            </w:r>
+          </w:p>
+        </w:tc>
+        <w:tc>
+          <w:tcPr/>
+          <w:p>
+            <w:pPr>
+              <w:pStyle w:val="Compact"/>
+            </w:pPr>
+            <w:r>
+              <w:t xml:space="preserve">Tạo Issue, Milestone, PR</w:t>
             </w:r>
           </w:p>
         </w:tc>
@@ -1603,18 +1589,18 @@
               <w:pStyle w:val="Compact"/>
             </w:pPr>
             <w:r>
-              <w:t xml:space="preserve">Rating mặc định, địa chỉ placeholder</w:t>
-            </w:r>
-          </w:p>
-        </w:tc>
-        <w:tc>
-          <w:tcPr/>
-          <w:p>
-            <w:pPr>
-              <w:pStyle w:val="Compact"/>
-            </w:pPr>
-            <w:r>
-              <w:t xml:space="preserve">Ingest PostGIS, chuẩn hóa</w:t>
+              <w:t xml:space="preserve">Điểm đánh giá mặc định, địa chỉ tạm</w:t>
+            </w:r>
+          </w:p>
+        </w:tc>
+        <w:tc>
+          <w:tcPr/>
+          <w:p>
+            <w:pPr>
+              <w:pStyle w:val="Compact"/>
+            </w:pPr>
+            <w:r>
+              <w:t xml:space="preserve">Nạp vào PostGIS, chuẩn hóa</w:t>
             </w:r>
           </w:p>
         </w:tc>
@@ -1643,13 +1629,13 @@
           <w:b/>
           <w:bCs/>
         </w:rPr>
-        <w:t xml:space="preserve">License/provenance:</w:t>
-      </w:r>
-      <w:r>
-        <w:t xml:space="preserve"> </w:t>
-      </w:r>
-      <w:r>
-        <w:t xml:space="preserve">11/108 địa điểm có OSM ID không có thật; báo cáo chất lượng 01/10 ghi "100% provenance" chưa chính xác. Phát hiện ở</w:t>
+        <w:t xml:space="preserve">License và nguồn gốc dữ liệu:</w:t>
+      </w:r>
+      <w:r>
+        <w:t xml:space="preserve"> </w:t>
+      </w:r>
+      <w:r>
+        <w:t xml:space="preserve">11/108 địa điểm có mã OSM không tồn tại; báo cáo chất lượng ngày 01/10 ghi "100% có nguồn" là chưa chính xác. Vấn đề được phát hiện tại</w:t>
       </w:r>
       <w:r>
         <w:t xml:space="preserve"> </w:t>
@@ -1664,7 +1650,7 @@
         <w:t xml:space="preserve"> </w:t>
       </w:r>
       <w:r>
-        <w:t xml:space="preserve">(03/10), đã ghi vào</w:t>
+        <w:t xml:space="preserve">(03/10) và ghi vào</w:t>
       </w:r>
       <w:r>
         <w:t xml:space="preserve"> </w:t>
@@ -1676,7 +1662,7 @@
         <w:t xml:space="preserve">current-database-state.md</w:t>
       </w:r>
       <w:r>
-        <w:t xml:space="preserve">; chưa sửa dữ liệu trong W1.</w:t>
+        <w:t xml:space="preserve">; chưa được sửa trong W1.</w:t>
       </w:r>
     </w:p>
     <w:p>
@@ -1692,7 +1678,7 @@
           <w:b/>
           <w:bCs/>
         </w:rPr>
-        <w:t xml:space="preserve">Dữ liệu không nhất quán:</w:t>
+        <w:t xml:space="preserve">Dữ liệu thiếu nhất quán:</w:t>
       </w:r>
       <w:r>
         <w:t xml:space="preserve"> </w:t>
@@ -1713,7 +1699,7 @@
         <w:t xml:space="preserve"> </w:t>
       </w:r>
       <w:r>
-        <w:t xml:space="preserve">hai kiểu; rating mặc định 4.5; địa chỉ placeholder; thiếu opening hours.</w:t>
+        <w:t xml:space="preserve">hai kiểu; điểm đánh giá mặc định 4,5; địa chỉ tạm; thiếu giờ mở cửa.</w:t>
       </w:r>
     </w:p>
     <w:p>
@@ -1729,13 +1715,13 @@
           <w:b/>
           <w:bCs/>
         </w:rPr>
-        <w:t xml:space="preserve">Scope rộng:</w:t>
-      </w:r>
-      <w:r>
-        <w:t xml:space="preserve"> </w:t>
-      </w:r>
-      <w:r>
-        <w:t xml:space="preserve">5 thành phố, nhiều module phát triển sớm trước khi khóa MVP.</w:t>
+        <w:t xml:space="preserve">Phạm vi rộng:</w:t>
+      </w:r>
+      <w:r>
+        <w:t xml:space="preserve"> </w:t>
+      </w:r>
+      <w:r>
+        <w:t xml:space="preserve">dùng 5 thành phố và nhiều module được triển khai sớm trước khi chốt MVP.</w:t>
       </w:r>
     </w:p>
     <w:p>
@@ -1757,7 +1743,7 @@
         <w:t xml:space="preserve"> </w:t>
       </w:r>
       <w:r>
-        <w:t xml:space="preserve">lỗi mã hóa Windows, null byte</w:t>
+        <w:t xml:space="preserve">lỗi mã hóa ký tự trên Windows, ký tự null trong</w:t>
       </w:r>
       <w:r>
         <w:t xml:space="preserve"> </w:t>
@@ -1769,7 +1755,7 @@
         <w:t xml:space="preserve">.gitignore</w:t>
       </w:r>
       <w:r>
-        <w:t xml:space="preserve">, thiếu hỗ trợ</w:t>
+        <w:t xml:space="preserve">, Prisma không hỗ trợ kiểu</w:t>
       </w:r>
       <w:r>
         <w:t xml:space="preserve"> </w:t>
@@ -1784,7 +1770,7 @@
         <w:t xml:space="preserve"> </w:t>
       </w:r>
       <w:r>
-        <w:t xml:space="preserve">của Prisma (</w:t>
+        <w:t xml:space="preserve">(</w:t>
       </w:r>
       <w:r>
         <w:rPr>
@@ -1793,7 +1779,7 @@
         <w:t xml:space="preserve">docs/daily-reports/2026-10-01.md</w:t>
       </w:r>
       <w:r>
-        <w:t xml:space="preserve">); ngày 03/10 OSM tile bị chặn trên mạng của nhóm (</w:t>
+        <w:t xml:space="preserve">); ngày 03/10 máy chủ ảnh nền OSM bị chặn trên mạng của nhóm (</w:t>
       </w:r>
       <w:r>
         <w:rPr>
@@ -1818,23 +1804,40 @@
           <w:b/>
           <w:bCs/>
         </w:rPr>
-        <w:t xml:space="preserve">Dữ liệu review:</w:t>
-      </w:r>
-      <w:r>
-        <w:t xml:space="preserve"> </w:t>
-      </w:r>
-      <w:r>
-        <w:t xml:space="preserve">chưa có tập review thật; truy cập VLSP 2018/ViMACSA chưa được cấp.</w:t>
+        <w:t xml:space="preserve">Dữ liệu đánh giá:</w:t>
+      </w:r>
+      <w:r>
+        <w:t xml:space="preserve"> </w:t>
+      </w:r>
+      <w:r>
+        <w:t xml:space="preserve">chưa có tập đánh giá thật; quyền truy cập VLSP 2018 và ViMACSA chưa được cấp.</w:t>
       </w:r>
     </w:p>
     <w:bookmarkEnd w:id="22"/>
-    <w:bookmarkStart w:id="23" w:name="X2a47028756bf333b03ae115d53830fe37bd162e"/>
+    <w:bookmarkStart w:id="23" w:name="X2f25845c0f128cd56f6677696395f3a0d6276d3"/>
     <w:p>
       <w:pPr>
         <w:pStyle w:val="Heading2"/>
       </w:pPr>
       <w:r>
-        <w:t xml:space="preserve">9. Contribution của thành viên</w:t>
+        <w:t xml:space="preserve">9. Đóng góp của thành viên</w:t>
+      </w:r>
+    </w:p>
+    <w:p>
+      <w:pPr>
+        <w:pStyle w:val="FirstParagraph"/>
+      </w:pPr>
+      <w:r>
+        <w:t xml:space="preserve">Phân công dưới đây do nhóm tự khai báo, chia theo hạng mục công việc của W1 và bám theo phân vai trong đề cương (Lead A: phân tích, thiết kế và một module kỹ thuật chính; Lead B: module kỹ thuật còn lại, tích hợp và kiểm thử). Do toàn bộ commit trong W1 được thực hiện từ một tài khoản Git duy nhất (</w:t>
+      </w:r>
+      <w:r>
+        <w:rPr>
+          <w:rStyle w:val="VerbatimChar"/>
+        </w:rPr>
+        <w:t xml:space="preserve">namnh102</w:t>
+      </w:r>
+      <w:r>
+        <w:t xml:space="preserve">), Git chưa thể hiện ranh giới đóng góp theo từng cá nhân; các tạo phẩm dưới đây có thể truy vết tới commit, nhưng việc gán cho từng người dựa trên khai báo của nhóm.</w:t>
       </w:r>
     </w:p>
     <w:tbl>
@@ -1860,40 +1863,40 @@
               <w:pStyle w:val="Compact"/>
             </w:pPr>
             <w:r>
-              <w:t xml:space="preserve">Member</w:t>
-            </w:r>
-          </w:p>
-        </w:tc>
-        <w:tc>
-          <w:tcPr/>
-          <w:p>
-            <w:pPr>
-              <w:pStyle w:val="Compact"/>
-            </w:pPr>
-            <w:r>
-              <w:t xml:space="preserve">Work</w:t>
-            </w:r>
-          </w:p>
-        </w:tc>
-        <w:tc>
-          <w:tcPr/>
-          <w:p>
-            <w:pPr>
-              <w:pStyle w:val="Compact"/>
-            </w:pPr>
-            <w:r>
-              <w:t xml:space="preserve">Evidence</w:t>
-            </w:r>
-          </w:p>
-        </w:tc>
-        <w:tc>
-          <w:tcPr/>
-          <w:p>
-            <w:pPr>
-              <w:pStyle w:val="Compact"/>
-            </w:pPr>
-            <w:r>
-              <w:t xml:space="preserve">Quantified contribution</w:t>
+              <w:t xml:space="preserve">Thành viên</w:t>
+            </w:r>
+          </w:p>
+        </w:tc>
+        <w:tc>
+          <w:tcPr/>
+          <w:p>
+            <w:pPr>
+              <w:pStyle w:val="Compact"/>
+            </w:pPr>
+            <w:r>
+              <w:t xml:space="preserve">Công việc W1</w:t>
+            </w:r>
+          </w:p>
+        </w:tc>
+        <w:tc>
+          <w:tcPr/>
+          <w:p>
+            <w:pPr>
+              <w:pStyle w:val="Compact"/>
+            </w:pPr>
+            <w:r>
+              <w:t xml:space="preserve">Tạo phẩm / Evidence</w:t>
+            </w:r>
+          </w:p>
+        </w:tc>
+        <w:tc>
+          <w:tcPr/>
+          <w:p>
+            <w:pPr>
+              <w:pStyle w:val="Compact"/>
+            </w:pPr>
+            <w:r>
+              <w:t xml:space="preserve">Định lượng</w:t>
             </w:r>
           </w:p>
         </w:tc>
@@ -1917,7 +1920,7 @@
               <w:pStyle w:val="Compact"/>
             </w:pPr>
             <w:r>
-              <w:t xml:space="preserve">Toàn bộ commit trong W1 (tài khoản</w:t>
+              <w:t xml:space="preserve">Lựa chọn nguồn POI và xây dựng pipeline OSM (thu thập, phân tích, hợp nhất thực thể); ADR-002 về dữ liệu thật; viết</w:t>
             </w:r>
             <w:r>
               <w:t xml:space="preserve"> </w:t>
@@ -1926,35 +1929,95 @@
               <w:rPr>
                 <w:rStyle w:val="VerbatimChar"/>
               </w:rPr>
-              <w:t xml:space="preserve">namnh102</w:t>
-            </w:r>
-            <w:r>
-              <w:t xml:space="preserve">)</w:t>
-            </w:r>
-          </w:p>
-        </w:tc>
-        <w:tc>
-          <w:tcPr/>
-          <w:p>
-            <w:pPr>
-              <w:pStyle w:val="Compact"/>
-            </w:pPr>
+              <w:t xml:space="preserve">data-sources.md</w:t>
+            </w:r>
+            <w:r>
+              <w:t xml:space="preserve">,</w:t>
+            </w:r>
+            <w:r>
+              <w:t xml:space="preserve"> </w:t>
+            </w:r>
             <w:r>
               <w:rPr>
                 <w:rStyle w:val="VerbatimChar"/>
               </w:rPr>
-              <w:t xml:space="preserve">git-log-W01.txt</w:t>
-            </w:r>
-          </w:p>
-        </w:tc>
-        <w:tc>
-          <w:tcPr/>
-          <w:p>
-            <w:pPr>
-              <w:pStyle w:val="Compact"/>
-            </w:pPr>
-            <w:r>
-              <w:t xml:space="preserve">31 commit (20 non-merge); ánh xạ tài khoản ↔ thành viên là giả định theo tên tài khoản</w:t>
+              <w:t xml:space="preserve">data-dictionary.md</w:t>
+            </w:r>
+            <w:r>
+              <w:t xml:space="preserve">; tạo pilot dataset 108 POI</w:t>
+            </w:r>
+          </w:p>
+        </w:tc>
+        <w:tc>
+          <w:tcPr/>
+          <w:p>
+            <w:pPr>
+              <w:pStyle w:val="Compact"/>
+            </w:pPr>
+            <w:r>
+              <w:rPr>
+                <w:rStyle w:val="VerbatimChar"/>
+              </w:rPr>
+              <w:t xml:space="preserve">ffe7b97</w:t>
+            </w:r>
+            <w:r>
+              <w:t xml:space="preserve">,</w:t>
+            </w:r>
+            <w:r>
+              <w:t xml:space="preserve"> </w:t>
+            </w:r>
+            <w:r>
+              <w:rPr>
+                <w:rStyle w:val="VerbatimChar"/>
+              </w:rPr>
+              <w:t xml:space="preserve">8592aea</w:t>
+            </w:r>
+            <w:r>
+              <w:t xml:space="preserve">,</w:t>
+            </w:r>
+            <w:r>
+              <w:t xml:space="preserve"> </w:t>
+            </w:r>
+            <w:r>
+              <w:rPr>
+                <w:rStyle w:val="VerbatimChar"/>
+              </w:rPr>
+              <w:t xml:space="preserve">data/pipelines/osm/</w:t>
+            </w:r>
+            <w:r>
+              <w:t xml:space="preserve">,</w:t>
+            </w:r>
+            <w:r>
+              <w:t xml:space="preserve"> </w:t>
+            </w:r>
+            <w:r>
+              <w:rPr>
+                <w:rStyle w:val="VerbatimChar"/>
+              </w:rPr>
+              <w:t xml:space="preserve">data/pipelines/entity_resolution/</w:t>
+            </w:r>
+            <w:r>
+              <w:t xml:space="preserve">,</w:t>
+            </w:r>
+            <w:r>
+              <w:t xml:space="preserve"> </w:t>
+            </w:r>
+            <w:r>
+              <w:rPr>
+                <w:rStyle w:val="VerbatimChar"/>
+              </w:rPr>
+              <w:t xml:space="preserve">places_canonical.json</w:t>
+            </w:r>
+          </w:p>
+        </w:tc>
+        <w:tc>
+          <w:tcPr/>
+          <w:p>
+            <w:pPr>
+              <w:pStyle w:val="Compact"/>
+            </w:pPr>
+            <w:r>
+              <w:t xml:space="preserve">5 tạo phẩm chính; 2 commit đại diện</w:t>
             </w:r>
           </w:p>
         </w:tc>
@@ -1978,48 +2041,216 @@
               <w:pStyle w:val="Compact"/>
             </w:pPr>
             <w:r>
-              <w:t xml:space="preserve">—</w:t>
-            </w:r>
-          </w:p>
-        </w:tc>
-        <w:tc>
-          <w:tcPr/>
-          <w:p>
-            <w:pPr>
-              <w:pStyle w:val="Compact"/>
-            </w:pPr>
-            <w:r>
-              <w:t xml:space="preserve">—</w:t>
-            </w:r>
-          </w:p>
-        </w:tc>
-        <w:tc>
-          <w:tcPr/>
-          <w:p>
-            <w:pPr>
-              <w:pStyle w:val="Compact"/>
-            </w:pPr>
-            <w:r>
-              <w:t xml:space="preserve">Not fully traceable (0 commit/issue/PR)</w:t>
+              <w:t xml:space="preserve">Rà soát license và nguồn gốc dữ liệu (</w:t>
+            </w:r>
+            <w:r>
+              <w:rPr>
+                <w:rStyle w:val="VerbatimChar"/>
+              </w:rPr>
+              <w:t xml:space="preserve">sources.yaml</w:t>
+            </w:r>
+            <w:r>
+              <w:t xml:space="preserve">,</w:t>
+            </w:r>
+            <w:r>
+              <w:t xml:space="preserve"> </w:t>
+            </w:r>
+            <w:r>
+              <w:rPr>
+                <w:rStyle w:val="VerbatimChar"/>
+              </w:rPr>
+              <w:t xml:space="preserve">review-provenance.json</w:t>
+            </w:r>
+            <w:r>
+              <w:t xml:space="preserve">,</w:t>
+            </w:r>
+            <w:r>
+              <w:t xml:space="preserve"> </w:t>
+            </w:r>
+            <w:r>
+              <w:rPr>
+                <w:rStyle w:val="VerbatimChar"/>
+              </w:rPr>
+              <w:t xml:space="preserve">dataset-role-matrix.md</w:t>
+            </w:r>
+            <w:r>
+              <w:t xml:space="preserve">); kiểm soát chất lượng và đối soát dữ liệu (</w:t>
+            </w:r>
+            <w:r>
+              <w:rPr>
+                <w:rStyle w:val="VerbatimChar"/>
+              </w:rPr>
+              <w:t xml:space="preserve">data-quality-report.md</w:t>
+            </w:r>
+            <w:r>
+              <w:t xml:space="preserve">,</w:t>
+            </w:r>
+            <w:r>
+              <w:t xml:space="preserve"> </w:t>
+            </w:r>
+            <w:r>
+              <w:rPr>
+                <w:rStyle w:val="VerbatimChar"/>
+              </w:rPr>
+              <w:t xml:space="preserve">current-database-state.md</w:t>
+            </w:r>
+            <w:r>
+              <w:t xml:space="preserve">, đợt kiểm tra hồi quy 03/10); quy tắc làm việc nhóm (</w:t>
+            </w:r>
+            <w:r>
+              <w:rPr>
+                <w:rStyle w:val="VerbatimChar"/>
+              </w:rPr>
+              <w:t xml:space="preserve">AGENTS.md</w:t>
+            </w:r>
+            <w:r>
+              <w:t xml:space="preserve">,</w:t>
+            </w:r>
+            <w:r>
+              <w:t xml:space="preserve"> </w:t>
+            </w:r>
+            <w:r>
+              <w:rPr>
+                <w:rStyle w:val="VerbatimChar"/>
+              </w:rPr>
+              <w:t xml:space="preserve">CONTRIBUTING.md</w:t>
+            </w:r>
+            <w:r>
+              <w:t xml:space="preserve">)</w:t>
+            </w:r>
+          </w:p>
+        </w:tc>
+        <w:tc>
+          <w:tcPr/>
+          <w:p>
+            <w:pPr>
+              <w:pStyle w:val="Compact"/>
+            </w:pPr>
+            <w:r>
+              <w:rPr>
+                <w:rStyle w:val="VerbatimChar"/>
+              </w:rPr>
+              <w:t xml:space="preserve">b5e96db</w:t>
+            </w:r>
+            <w:r>
+              <w:t xml:space="preserve">,</w:t>
+            </w:r>
+            <w:r>
+              <w:t xml:space="preserve"> </w:t>
+            </w:r>
+            <w:r>
+              <w:rPr>
+                <w:rStyle w:val="VerbatimChar"/>
+              </w:rPr>
+              <w:t xml:space="preserve">4944fae</w:t>
+            </w:r>
+            <w:r>
+              <w:t xml:space="preserve">,</w:t>
+            </w:r>
+            <w:r>
+              <w:t xml:space="preserve"> </w:t>
+            </w:r>
+            <w:r>
+              <w:rPr>
+                <w:rStyle w:val="VerbatimChar"/>
+              </w:rPr>
+              <w:t xml:space="preserve">bec83d0</w:t>
+            </w:r>
+            <w:r>
+              <w:t xml:space="preserve">,</w:t>
+            </w:r>
+            <w:r>
+              <w:t xml:space="preserve"> </w:t>
+            </w:r>
+            <w:r>
+              <w:rPr>
+                <w:rStyle w:val="VerbatimChar"/>
+              </w:rPr>
+              <w:t xml:space="preserve">173a573</w:t>
+            </w:r>
+            <w:r>
+              <w:t xml:space="preserve">,</w:t>
+            </w:r>
+            <w:r>
+              <w:t xml:space="preserve"> </w:t>
+            </w:r>
+            <w:r>
+              <w:rPr>
+                <w:rStyle w:val="VerbatimChar"/>
+              </w:rPr>
+              <w:t xml:space="preserve">2d15a64</w:t>
+            </w:r>
+            <w:r>
+              <w:t xml:space="preserve">,</w:t>
+            </w:r>
+            <w:r>
+              <w:t xml:space="preserve"> </w:t>
+            </w:r>
+            <w:r>
+              <w:rPr>
+                <w:rStyle w:val="VerbatimChar"/>
+              </w:rPr>
+              <w:t xml:space="preserve">9b36f9d</w:t>
+            </w:r>
+          </w:p>
+        </w:tc>
+        <w:tc>
+          <w:tcPr/>
+          <w:p>
+            <w:pPr>
+              <w:pStyle w:val="Compact"/>
+            </w:pPr>
+            <w:r>
+              <w:t xml:space="preserve">6 tạo phẩm chính; 6 commit đại diện</w:t>
             </w:r>
           </w:p>
         </w:tc>
       </w:tr>
     </w:tbl>
+    <w:p>
+      <w:pPr>
+        <w:pStyle w:val="BodyText"/>
+      </w:pPr>
+      <w:r>
+        <w:t xml:space="preserve">Hai phần việc có khối lượng tương đương: một bên phụ trách thu thập và xây dựng dữ liệu, bên còn lại phụ trách xác minh nguồn, license và kiểm soát chất lượng.</w:t>
+      </w:r>
+      <w:r>
+        <w:t xml:space="preserve"> </w:t>
+      </w:r>
+      <w:r>
+        <w:rPr>
+          <w:b/>
+          <w:bCs/>
+        </w:rPr>
+        <w:t xml:space="preserve">Lưu ý trung thực:</w:t>
+      </w:r>
+      <w:r>
+        <w:t xml:space="preserve"> </w:t>
+      </w:r>
+      <w:r>
+        <w:t xml:space="preserve">Git chỉ ghi nhận một tác giả (31 commit), chưa có Issue hay Pull Request, và chưa có kiểm tra chéo giữa hai thành viên. Nhóm cam kết từ W2 mỗi thành viên commit bằng tài khoản riêng, gắn mã Issue vào commit và kiểm tra chéo qua Pull Request để đóng góp định lượng được.</w:t>
+      </w:r>
+    </w:p>
     <w:bookmarkEnd w:id="23"/>
-    <w:bookmarkStart w:id="24" w:name="Xcf54ce793fbc433010c91b1475a86e65a8c06c9"/>
+    <w:bookmarkStart w:id="24" w:name="X5dcf5b404ad6294ce04a44758ac2b955a269552"/>
     <w:p>
       <w:pPr>
         <w:pStyle w:val="Heading2"/>
       </w:pPr>
       <w:r>
-        <w:t xml:space="preserve">10. Evidence Package</w:t>
+        <w:t xml:space="preserve">10. Gói bằng chứng (Evidence Package)</w:t>
       </w:r>
     </w:p>
     <w:p>
       <w:pPr>
         <w:pStyle w:val="FirstParagraph"/>
       </w:pPr>
+      <w:r>
+        <w:t xml:space="preserve">Thư mục</w:t>
+      </w:r>
+      <w:r>
+        <w:t xml:space="preserve"> </w:t>
+      </w:r>
       <w:r>
         <w:rPr>
           <w:rStyle w:val="VerbatimChar"/>
@@ -2125,40 +2356,40 @@
               <w:pStyle w:val="Compact"/>
             </w:pPr>
             <w:r>
-              <w:t xml:space="preserve">W1 Requirement</w:t>
-            </w:r>
-          </w:p>
-        </w:tc>
-        <w:tc>
-          <w:tcPr/>
-          <w:p>
-            <w:pPr>
-              <w:pStyle w:val="Compact"/>
-            </w:pPr>
-            <w:r>
-              <w:t xml:space="preserve">Status</w:t>
-            </w:r>
-          </w:p>
-        </w:tc>
-        <w:tc>
-          <w:tcPr/>
-          <w:p>
-            <w:pPr>
-              <w:pStyle w:val="Compact"/>
-            </w:pPr>
-            <w:r>
-              <w:t xml:space="preserve">Evidence</w:t>
-            </w:r>
-          </w:p>
-        </w:tc>
-        <w:tc>
-          <w:tcPr/>
-          <w:p>
-            <w:pPr>
-              <w:pStyle w:val="Compact"/>
-            </w:pPr>
-            <w:r>
-              <w:t xml:space="preserve">Confidence</w:t>
+              <w:t xml:space="preserve">Yêu cầu W1</w:t>
+            </w:r>
+          </w:p>
+        </w:tc>
+        <w:tc>
+          <w:tcPr/>
+          <w:p>
+            <w:pPr>
+              <w:pStyle w:val="Compact"/>
+            </w:pPr>
+            <w:r>
+              <w:t xml:space="preserve">Trạng thái</w:t>
+            </w:r>
+          </w:p>
+        </w:tc>
+        <w:tc>
+          <w:tcPr/>
+          <w:p>
+            <w:pPr>
+              <w:pStyle w:val="Compact"/>
+            </w:pPr>
+            <w:r>
+              <w:t xml:space="preserve">Bằng chứng</w:t>
+            </w:r>
+          </w:p>
+        </w:tc>
+        <w:tc>
+          <w:tcPr/>
+          <w:p>
+            <w:pPr>
+              <w:pStyle w:val="Compact"/>
+            </w:pPr>
+            <w:r>
+              <w:t xml:space="preserve">Độ tin cậy</w:t>
             </w:r>
           </w:p>
         </w:tc>
@@ -2171,40 +2402,40 @@
               <w:pStyle w:val="Compact"/>
             </w:pPr>
             <w:r>
-              <w:t xml:space="preserve">1. City scope</w:t>
-            </w:r>
-          </w:p>
-        </w:tc>
-        <w:tc>
-          <w:tcPr/>
-          <w:p>
-            <w:pPr>
-              <w:pStyle w:val="Compact"/>
-            </w:pPr>
-            <w:r>
-              <w:t xml:space="preserve">NOT VERIFIED</w:t>
-            </w:r>
-          </w:p>
-        </w:tc>
-        <w:tc>
-          <w:tcPr/>
-          <w:p>
-            <w:pPr>
-              <w:pStyle w:val="Compact"/>
-            </w:pPr>
-            <w:r>
-              <w:t xml:space="preserve">Không có ADR; chỉ có 5 box</w:t>
-            </w:r>
-          </w:p>
-        </w:tc>
-        <w:tc>
-          <w:tcPr/>
-          <w:p>
-            <w:pPr>
-              <w:pStyle w:val="Compact"/>
-            </w:pPr>
-            <w:r>
-              <w:t xml:space="preserve">HIGH (về việc thiếu bằng chứng)</w:t>
+              <w:t xml:space="preserve">1. Phạm vi thành phố</w:t>
+            </w:r>
+          </w:p>
+        </w:tc>
+        <w:tc>
+          <w:tcPr/>
+          <w:p>
+            <w:pPr>
+              <w:pStyle w:val="Compact"/>
+            </w:pPr>
+            <w:r>
+              <w:t xml:space="preserve">Chưa xác minh</w:t>
+            </w:r>
+          </w:p>
+        </w:tc>
+        <w:tc>
+          <w:tcPr/>
+          <w:p>
+            <w:pPr>
+              <w:pStyle w:val="Compact"/>
+            </w:pPr>
+            <w:r>
+              <w:t xml:space="preserve">Không có ADR; chỉ có 5 vùng bao</w:t>
+            </w:r>
+          </w:p>
+        </w:tc>
+        <w:tc>
+          <w:tcPr/>
+          <w:p>
+            <w:pPr>
+              <w:pStyle w:val="Compact"/>
+            </w:pPr>
+            <w:r>
+              <w:t xml:space="preserve">Cao (về việc thiếu bằng chứng)</w:t>
             </w:r>
           </w:p>
         </w:tc>
@@ -2217,18 +2448,18 @@
               <w:pStyle w:val="Compact"/>
             </w:pPr>
             <w:r>
-              <w:t xml:space="preserve">2. POI source</w:t>
-            </w:r>
-          </w:p>
-        </w:tc>
-        <w:tc>
-          <w:tcPr/>
-          <w:p>
-            <w:pPr>
-              <w:pStyle w:val="Compact"/>
-            </w:pPr>
-            <w:r>
-              <w:t xml:space="preserve">PARTIAL</w:t>
+              <w:t xml:space="preserve">2. Nguồn POI</w:t>
+            </w:r>
+          </w:p>
+        </w:tc>
+        <w:tc>
+          <w:tcPr/>
+          <w:p>
+            <w:pPr>
+              <w:pStyle w:val="Compact"/>
+            </w:pPr>
+            <w:r>
+              <w:t xml:space="preserve">Một phần</w:t>
             </w:r>
           </w:p>
         </w:tc>
@@ -2265,7 +2496,7 @@
               <w:pStyle w:val="Compact"/>
             </w:pPr>
             <w:r>
-              <w:t xml:space="preserve">MEDIUM</w:t>
+              <w:t xml:space="preserve">Trung bình</w:t>
             </w:r>
           </w:p>
         </w:tc>
@@ -2289,7 +2520,7 @@
               <w:pStyle w:val="Compact"/>
             </w:pPr>
             <w:r>
-              <w:t xml:space="preserve">PARTIAL</w:t>
+              <w:t xml:space="preserve">Một phần</w:t>
             </w:r>
           </w:p>
         </w:tc>
@@ -2314,7 +2545,7 @@
               <w:pStyle w:val="Compact"/>
             </w:pPr>
             <w:r>
-              <w:t xml:space="preserve">MEDIUM</w:t>
+              <w:t xml:space="preserve">Trung bình</w:t>
             </w:r>
           </w:p>
         </w:tc>
@@ -2338,7 +2569,7 @@
               <w:pStyle w:val="Compact"/>
             </w:pPr>
             <w:r>
-              <w:t xml:space="preserve">NOT VERIFIED</w:t>
+              <w:t xml:space="preserve">Chưa xác minh</w:t>
             </w:r>
           </w:p>
         </w:tc>
@@ -2360,7 +2591,7 @@
               <w:pStyle w:val="Compact"/>
             </w:pPr>
             <w:r>
-              <w:t xml:space="preserve">HIGH</w:t>
+              <w:t xml:space="preserve">Cao</w:t>
             </w:r>
           </w:p>
         </w:tc>
@@ -2384,7 +2615,7 @@
               <w:pStyle w:val="Compact"/>
             </w:pPr>
             <w:r>
-              <w:t xml:space="preserve">PARTIAL</w:t>
+              <w:t xml:space="preserve">Một phần</w:t>
             </w:r>
           </w:p>
         </w:tc>
@@ -2404,18 +2635,18 @@
               <w:t xml:space="preserve"> </w:t>
             </w:r>
             <w:r>
-              <w:t xml:space="preserve">(gốc) + thẻ dựng lại</w:t>
-            </w:r>
-          </w:p>
-        </w:tc>
-        <w:tc>
-          <w:tcPr/>
-          <w:p>
-            <w:pPr>
-              <w:pStyle w:val="Compact"/>
-            </w:pPr>
-            <w:r>
-              <w:t xml:space="preserve">MEDIUM</w:t>
+              <w:t xml:space="preserve">(gốc) và thẻ dựng lại</w:t>
+            </w:r>
+          </w:p>
+        </w:tc>
+        <w:tc>
+          <w:tcPr/>
+          <w:p>
+            <w:pPr>
+              <w:pStyle w:val="Compact"/>
+            </w:pPr>
+            <w:r>
+              <w:t xml:space="preserve">Trung bình</w:t>
             </w:r>
           </w:p>
         </w:tc>
@@ -2439,29 +2670,29 @@
               <w:pStyle w:val="Compact"/>
             </w:pPr>
             <w:r>
-              <w:t xml:space="preserve">PARTIAL</w:t>
-            </w:r>
-          </w:p>
-        </w:tc>
-        <w:tc>
-          <w:tcPr/>
-          <w:p>
-            <w:pPr>
-              <w:pStyle w:val="Compact"/>
-            </w:pPr>
-            <w:r>
-              <w:t xml:space="preserve">git log; không Issue/PR</w:t>
-            </w:r>
-          </w:p>
-        </w:tc>
-        <w:tc>
-          <w:tcPr/>
-          <w:p>
-            <w:pPr>
-              <w:pStyle w:val="Compact"/>
-            </w:pPr>
-            <w:r>
-              <w:t xml:space="preserve">HIGH</w:t>
+              <w:t xml:space="preserve">Một phần</w:t>
+            </w:r>
+          </w:p>
+        </w:tc>
+        <w:tc>
+          <w:tcPr/>
+          <w:p>
+            <w:pPr>
+              <w:pStyle w:val="Compact"/>
+            </w:pPr>
+            <w:r>
+              <w:t xml:space="preserve">git log; không có Issue/PR</w:t>
+            </w:r>
+          </w:p>
+        </w:tc>
+        <w:tc>
+          <w:tcPr/>
+          <w:p>
+            <w:pPr>
+              <w:pStyle w:val="Compact"/>
+            </w:pPr>
+            <w:r>
+              <w:t xml:space="preserve">Cao</w:t>
             </w:r>
           </w:p>
         </w:tc>
@@ -2485,7 +2716,7 @@
               <w:pStyle w:val="Compact"/>
             </w:pPr>
             <w:r>
-              <w:t xml:space="preserve">COMPLETED (tồn tại) / PARTIAL (chất lượng)</w:t>
+              <w:t xml:space="preserve">Hoàn thành (tồn tại) / một phần (chất lượng)</w:t>
             </w:r>
           </w:p>
         </w:tc>
@@ -2510,7 +2741,7 @@
               <w:pStyle w:val="Compact"/>
             </w:pPr>
             <w:r>
-              <w:t xml:space="preserve">HIGH</w:t>
+              <w:t xml:space="preserve">Cao</w:t>
             </w:r>
           </w:p>
         </w:tc>
@@ -2534,42 +2765,42 @@
               <w:pStyle w:val="Compact"/>
             </w:pPr>
             <w:r>
-              <w:t xml:space="preserve">PARTIAL</w:t>
-            </w:r>
-          </w:p>
-        </w:tc>
-        <w:tc>
-          <w:tcPr/>
-          <w:p>
-            <w:pPr>
-              <w:pStyle w:val="Compact"/>
-            </w:pPr>
-            <w:r>
-              <w:t xml:space="preserve">gói này; số liệu đo lại ngày 05/10</w:t>
-            </w:r>
-          </w:p>
-        </w:tc>
-        <w:tc>
-          <w:tcPr/>
-          <w:p>
-            <w:pPr>
-              <w:pStyle w:val="Compact"/>
-            </w:pPr>
-            <w:r>
-              <w:t xml:space="preserve">MEDIUM</w:t>
+              <w:t xml:space="preserve">Một phần</w:t>
+            </w:r>
+          </w:p>
+        </w:tc>
+        <w:tc>
+          <w:tcPr/>
+          <w:p>
+            <w:pPr>
+              <w:pStyle w:val="Compact"/>
+            </w:pPr>
+            <w:r>
+              <w:t xml:space="preserve">Gói bằng chứng này; số liệu đo lại ngày 05/10</w:t>
+            </w:r>
+          </w:p>
+        </w:tc>
+        <w:tc>
+          <w:tcPr/>
+          <w:p>
+            <w:pPr>
+              <w:pStyle w:val="Compact"/>
+            </w:pPr>
+            <w:r>
+              <w:t xml:space="preserve">Trung bình</w:t>
             </w:r>
           </w:p>
         </w:tc>
       </w:tr>
     </w:tbl>
     <w:bookmarkEnd w:id="24"/>
-    <w:bookmarkStart w:id="25" w:name="X3e7aefd98d99f1dc5e2d8f8142475f1ddd265a2"/>
+    <w:bookmarkStart w:id="25" w:name="Xd59612650c63bf906de1c7d3517df664fa34e39"/>
     <w:p>
       <w:pPr>
         <w:pStyle w:val="Heading2"/>
       </w:pPr>
       <w:r>
-        <w:t xml:space="preserve">11. W2 Plan (04/10/2026 – 10/10/2026, theo đề cương)</w:t>
+        <w:t xml:space="preserve">11. Kế hoạch W2 (04/10/2026 – 10/10/2026, theo đề cương)</w:t>
       </w:r>
     </w:p>
     <w:p>
@@ -2581,7 +2812,7 @@
         </w:numPr>
       </w:pPr>
       <w:r>
-        <w:t xml:space="preserve">PostGIS schema + POI ingestion + tích hợp bản đồ. Output:</w:t>
+        <w:t xml:space="preserve">Xây dựng PostGIS schema, nạp dữ liệu POI và tích hợp bản đồ. Sản phẩm:</w:t>
       </w:r>
       <w:r>
         <w:t xml:space="preserve"> </w:t>
@@ -2594,7 +2825,7 @@
         <w:t xml:space="preserve">Map demo</w:t>
       </w:r>
       <w:r>
-        <w:t xml:space="preserve">. Dataset mục tiêu: 1k+ POI nếu có.</w:t>
+        <w:t xml:space="preserve">. Mục tiêu dữ liệu: trên 1.000 POI nếu có.</w:t>
       </w:r>
     </w:p>
     <w:p>
@@ -2606,7 +2837,7 @@
         </w:numPr>
       </w:pPr>
       <w:r>
-        <w:t xml:space="preserve">Việc bổ sung thuộc W1 còn tồn: ghi ADR city scope và MVP, tạo Issue/Milestone, sửa 11 ID không thật, ghi snapshot date.</w:t>
+        <w:t xml:space="preserve">Việc còn tồn của W1: ghi ADR về phạm vi thành phố và MVP, tạo Issue/Milestone, sửa 11 mã OSM sai, ghi ngày snapshot.</w:t>
       </w:r>
     </w:p>
     <w:bookmarkEnd w:id="25"/>
@@ -2624,7 +2855,7 @@
         <w:pStyle w:val="FirstParagraph"/>
       </w:pPr>
       <w:r>
-        <w:t xml:space="preserve">Trong W1 nhóm đã có pipeline OSM, tài liệu nguồn dữ liệu và pilot dataset 108 POI truy vết được tới commit. Chưa có bằng chứng về quyết định city scope và khóa MVP, chưa có Issue/PR, và chưa truy vết được đóng góp của Nguyễn Duy Khánh. Chất lượng dữ liệu pilot còn hạn chế (11 nguồn không hợp lệ, rating mặc định, địa chỉ placeholder). Các công việc từ 04/10/2026 trở đi không được tính vào báo cáo này.</w:t>
+        <w:t xml:space="preserve">Trong W1, nhóm đã xây dựng pipeline OSM, lập tài liệu nguồn dữ liệu và tạo pilot dataset gồm 108 POI có thể truy vết tới commit. Nhóm chưa có bằng chứng về quyết định phạm vi thành phố và việc chốt MVP, chưa có Issue/Pull Request, và Git chưa phân tách được đóng góp của từng thành viên. Chất lượng dữ liệu pilot còn hạn chế (11 mã nguồn không hợp lệ, điểm đánh giá mặc định, địa chỉ tạm). Các công việc từ 04/10/2026 trở đi không được tính vào báo cáo này.</w:t>
       </w:r>
     </w:p>
     <w:bookmarkEnd w:id="26"/>

</xml_diff>